<commit_message>
Spec W3/W4/W6: Lab-Beispiele ohne Akten-Werte (D1–D7), Prüfwerte, FACHLICHE_KORREKTUREN Teil D
Co-Authored-By: Claude Opus 5.5 <noreply@anthropic.com>
Claude-Session: https://claude.ai/code/session_01JKXVQqFeKVmyQ9jfHw4db3
</commit_message>
<xml_diff>
--- a/materialien/00_Lehrerhinweise/KR_W4_Lehrerhinweise.docx
+++ b/materialien/00_Lehrerhinweise/KR_W4_Lehrerhinweise.docx
@@ -169,7 +169,7 @@
               <w:rPr>
                 <w:rFonts w:ascii="Georgia" w:hAnsi="Georgia" w:cs="Georgia" w:eastAsia="Georgia"/>
                 <w:b/>
-                <w:color w:val="1E7B4F"/>
+                <w:color w:val="14213D"/>
                 <w:sz w:val="34"/>
               </w:rPr>
               <w:t>Das Schlüsselproblem</w:t>
@@ -11110,7 +11110,7 @@
                 <w:color w:val="1B1B1F"/>
                 <w:sz w:val="17"/>
               </w:rPr>
-              <w:t>8 · 4 · 1 · 3 · 1</w:t>
+              <w:t>5 · 5 · 1 · 2 · 1</w:t>
             </w:r>
           </w:p>
         </w:tc>
@@ -11218,7 +11218,7 @@
                 <w:color w:val="1B1B1F"/>
                 <w:sz w:val="17"/>
               </w:rPr>
-              <w:t>(0, 1), (1, −1), (−1, 2), (2, −17); d = 43</w:t>
+              <w:t>(0, 1), (1, −2), (−2, 3), (3, −17); d = 23</w:t>
             </w:r>
           </w:p>
         </w:tc>
@@ -11434,7 +11434,7 @@
                 <w:color w:val="1B1B1F"/>
                 <w:sz w:val="17"/>
               </w:rPr>
-              <w:t>9 · 13 · 16 · 12</w:t>
+              <w:t>2 · 4 · 16 · 21</w:t>
             </w:r>
           </w:p>
         </w:tc>
@@ -11650,7 +11650,7 @@
                 <w:color w:val="1B1B1F"/>
                 <w:sz w:val="17"/>
               </w:rPr>
-              <w:t>60 · 58 · 53 · 37 · 60 · 64 · 4 · 9</w:t>
+              <w:t>Kette 48 · 71 · 36 · 64 · 15 · 71; m = 20</w:t>
             </w:r>
           </w:p>
         </w:tc>

</xml_diff>